<commit_message>
Add AdMob ads, Firebase analytics and edge-case updates
Co-Authored-By: Claude Sonnet 5.5 <noreply@anthropic.com>
</commit_message>
<xml_diff>
--- a/docs/prd/AppCleaner_PRD_v1_2.docx
+++ b/docs/prd/AppCleaner_PRD_v1_2.docx
@@ -65,6 +65,35 @@
           <w:p>
             <w:r>
               <w:t>App Cleaner: Uninstall Apps</w:t>
+            </w:r>
+          </w:p>
+        </w:tc>
+      </w:tr>
+      <w:tr>
+        <w:trPr>
+          <w:cantSplit/>
+        </w:trPr>
+        <w:tc>
+          <w:tcPr>
+            <w:tcW w:type="dxa" w:w="2400"/>
+            <w:shd w:val="clear" w:color="auto" w:fill="EEF1F3"/>
+          </w:tcPr>
+          <w:p>
+            <w:r>
+              <w:rPr>
+                <w:b/>
+              </w:rPr>
+              <w:t>Bundle ID</w:t>
+            </w:r>
+          </w:p>
+        </w:tc>
+        <w:tc>
+          <w:tcPr>
+            <w:tcW w:type="dxa" w:w="6960"/>
+          </w:tcPr>
+          <w:p>
+            <w:r>
+              <w:t>com.jedy.appcleaner.uninstaller</w:t>
             </w:r>
           </w:p>
         </w:tc>

</xml_diff>